<commit_message>
Bỏ phụ thuộc Drive: khoá API nhập trên web, cài đặt 6 tiêu chí Trao quyền, giữ hình ảnh gốc
- ⚙ Cài đặt: khoá API Claude lưu trên trình duyệt, gửi kèm từng lượt soạn
- TTCM sửa 6 tiêu chí Trao quyền chính thức, điểm mục tiêu, số vòng tự sửa ngay trên web
- Chép ảnh PNG/JPEG/GIF từ giáo án gốc sang KHBD mới qua ký hiệu [HÌNH n]; ảnh chưa gắn vào phụ lục
- Tập lệnh chạy trên máy cá nhân (Windows .bat, macOS/Linux .sh)
- Mẫu TA7 Lesson 1: đối chiếu đáp án Bài 2–5 với lời giải SGK, giữ 2 tranh từ vựng

Co-Authored-By: Claude Opus 5.5 <noreply@anthropic.com>
Claude-Session: https://claude.ai/code/session_013rNEKs6tcmtsXtauscuotv
</commit_message>
<xml_diff>
--- a/samples/output/TA7_Unit2_Lesson1_BaoCao.docx
+++ b/samples/output/TA7_Unit2_Lesson1_BaoCao.docx
@@ -4,7 +4,7 @@
   <w:body>
     <w:p>
       <w:pPr>
-        <w:spacing w:after="60" w:before="40" w:line="300"/>
+        <w:spacing w:after="60" w:before="40" w:line="300" w:lineRule="auto"/>
         <w:jc w:val="center"/>
       </w:pPr>
       <w:r>
@@ -20,7 +20,7 @@
     </w:p>
     <w:p>
       <w:pPr>
-        <w:spacing w:after="60" w:before="120" w:line="300"/>
+        <w:spacing w:after="60" w:before="120" w:line="300" w:lineRule="auto"/>
         <w:jc w:val="center"/>
       </w:pPr>
       <w:r>
@@ -36,7 +36,7 @@
     </w:p>
     <w:p>
       <w:pPr>
-        <w:spacing w:after="200" w:before="40" w:line="300"/>
+        <w:spacing w:after="200" w:before="40" w:line="300" w:lineRule="auto"/>
         <w:jc w:val="center"/>
       </w:pPr>
       <w:r>
@@ -52,7 +52,7 @@
     </w:p>
     <w:p>
       <w:pPr>
-        <w:spacing w:after="60" w:before="40" w:line="300"/>
+        <w:spacing w:after="60" w:before="40" w:line="300" w:lineRule="auto"/>
       </w:pPr>
       <w:r>
         <w:rPr>
@@ -65,7 +65,7 @@
     </w:p>
     <w:p>
       <w:pPr>
-        <w:spacing w:after="60" w:before="40" w:line="300"/>
+        <w:spacing w:after="60" w:before="40" w:line="300" w:lineRule="auto"/>
       </w:pPr>
       <w:r>
         <w:rPr>
@@ -75,13 +75,13 @@
           <w:sz w:val="20"/>
           <w:szCs w:val="20"/>
         </w:rPr>
-        <w:t xml:space="preserve">Ghi chú: 6 tiêu chí Trao quyền dùng để chấm là danh sách TẠM do tài liệu nguồn chưa liệt kê — xem config/school.json.</w:t>
+        <w:t xml:space="preserve">Ghi chú: 6 tiêu chí Trao quyền dùng để chấm là danh sách TẠM do tài liệu nguồn chưa liệt kê — TTCM cập nhật ở mục Cài đặt trên web.</w:t>
       </w:r>
     </w:p>
     <w:p>
       <w:pPr>
         <w:keepNext/>
-        <w:spacing w:after="80" w:before="200" w:line="300"/>
+        <w:spacing w:after="80" w:before="200" w:line="300" w:lineRule="auto"/>
       </w:pPr>
       <w:r>
         <w:rPr>
@@ -96,7 +96,7 @@
     </w:p>
     <w:p>
       <w:pPr>
-        <w:spacing w:after="60" w:before="40" w:line="300"/>
+        <w:spacing w:after="60" w:before="40" w:line="300" w:lineRule="auto"/>
       </w:pPr>
       <w:r>
         <w:rPr>
@@ -119,7 +119,7 @@
     </w:p>
     <w:p>
       <w:pPr>
-        <w:spacing w:after="60" w:before="40" w:line="300"/>
+        <w:spacing w:after="60" w:before="40" w:line="300" w:lineRule="auto"/>
       </w:pPr>
       <w:r>
         <w:rPr>
@@ -142,7 +142,7 @@
     </w:p>
     <w:p>
       <w:pPr>
-        <w:spacing w:after="60" w:before="40" w:line="300"/>
+        <w:spacing w:after="60" w:before="40" w:line="300" w:lineRule="auto"/>
       </w:pPr>
       <w:r>
         <w:rPr>
@@ -178,7 +178,7 @@
     </w:p>
     <w:p>
       <w:pPr>
-        <w:spacing w:after="60" w:before="40" w:line="300"/>
+        <w:spacing w:after="60" w:before="40" w:line="300" w:lineRule="auto"/>
       </w:pPr>
       <w:r>
         <w:rPr>
@@ -228,7 +228,7 @@
           </w:tcPr>
           <w:p>
             <w:pPr>
-              <w:spacing w:after="60" w:before="40" w:line="300"/>
+              <w:spacing w:after="60" w:before="40" w:line="300" w:lineRule="auto"/>
               <w:jc w:val="center"/>
             </w:pPr>
             <w:r>
@@ -257,7 +257,7 @@
           </w:tcPr>
           <w:p>
             <w:pPr>
-              <w:spacing w:after="60" w:before="40" w:line="300"/>
+              <w:spacing w:after="60" w:before="40" w:line="300" w:lineRule="auto"/>
               <w:jc w:val="center"/>
             </w:pPr>
             <w:r>
@@ -286,7 +286,7 @@
           </w:tcPr>
           <w:p>
             <w:pPr>
-              <w:spacing w:after="60" w:before="40" w:line="300"/>
+              <w:spacing w:after="60" w:before="40" w:line="300" w:lineRule="auto"/>
               <w:jc w:val="center"/>
             </w:pPr>
             <w:r>
@@ -315,7 +315,7 @@
           </w:tcPr>
           <w:p>
             <w:pPr>
-              <w:spacing w:after="60" w:before="40" w:line="300"/>
+              <w:spacing w:after="60" w:before="40" w:line="300" w:lineRule="auto"/>
               <w:jc w:val="center"/>
             </w:pPr>
             <w:r>
@@ -344,7 +344,7 @@
           </w:tcPr>
           <w:p>
             <w:pPr>
-              <w:spacing w:after="60" w:before="40" w:line="300"/>
+              <w:spacing w:after="60" w:before="40" w:line="300" w:lineRule="auto"/>
               <w:jc w:val="center"/>
             </w:pPr>
             <w:r>
@@ -377,7 +377,7 @@
           </w:tcPr>
           <w:p>
             <w:pPr>
-              <w:spacing w:after="60" w:before="40" w:line="300"/>
+              <w:spacing w:after="60" w:before="40" w:line="300" w:lineRule="auto"/>
             </w:pPr>
             <w:r>
               <w:rPr>
@@ -402,7 +402,7 @@
           </w:tcPr>
           <w:p>
             <w:pPr>
-              <w:spacing w:after="60" w:before="40" w:line="300"/>
+              <w:spacing w:after="60" w:before="40" w:line="300" w:lineRule="auto"/>
             </w:pPr>
             <w:r>
               <w:rPr>
@@ -427,7 +427,7 @@
           </w:tcPr>
           <w:p>
             <w:pPr>
-              <w:spacing w:after="60" w:before="40" w:line="300"/>
+              <w:spacing w:after="60" w:before="40" w:line="300" w:lineRule="auto"/>
             </w:pPr>
             <w:r>
               <w:rPr>
@@ -452,7 +452,7 @@
           </w:tcPr>
           <w:p>
             <w:pPr>
-              <w:spacing w:after="60" w:before="40" w:line="300"/>
+              <w:spacing w:after="60" w:before="40" w:line="300" w:lineRule="auto"/>
             </w:pPr>
             <w:r>
               <w:rPr>
@@ -477,7 +477,7 @@
           </w:tcPr>
           <w:p>
             <w:pPr>
-              <w:spacing w:after="60" w:before="40" w:line="300"/>
+              <w:spacing w:after="60" w:before="40" w:line="300" w:lineRule="auto"/>
             </w:pPr>
             <w:r>
               <w:rPr>
@@ -507,7 +507,7 @@
           </w:tcPr>
           <w:p>
             <w:pPr>
-              <w:spacing w:after="60" w:before="40" w:line="300"/>
+              <w:spacing w:after="60" w:before="40" w:line="300" w:lineRule="auto"/>
             </w:pPr>
             <w:r>
               <w:rPr>
@@ -532,7 +532,7 @@
           </w:tcPr>
           <w:p>
             <w:pPr>
-              <w:spacing w:after="60" w:before="40" w:line="300"/>
+              <w:spacing w:after="60" w:before="40" w:line="300" w:lineRule="auto"/>
             </w:pPr>
             <w:r>
               <w:rPr>
@@ -557,7 +557,7 @@
           </w:tcPr>
           <w:p>
             <w:pPr>
-              <w:spacing w:after="60" w:before="40" w:line="300"/>
+              <w:spacing w:after="60" w:before="40" w:line="300" w:lineRule="auto"/>
             </w:pPr>
             <w:r>
               <w:rPr>
@@ -582,7 +582,7 @@
           </w:tcPr>
           <w:p>
             <w:pPr>
-              <w:spacing w:after="60" w:before="40" w:line="300"/>
+              <w:spacing w:after="60" w:before="40" w:line="300" w:lineRule="auto"/>
             </w:pPr>
             <w:r>
               <w:rPr>
@@ -607,7 +607,7 @@
           </w:tcPr>
           <w:p>
             <w:pPr>
-              <w:spacing w:after="60" w:before="40" w:line="300"/>
+              <w:spacing w:after="60" w:before="40" w:line="300" w:lineRule="auto"/>
             </w:pPr>
             <w:r>
               <w:rPr>
@@ -637,7 +637,7 @@
           </w:tcPr>
           <w:p>
             <w:pPr>
-              <w:spacing w:after="60" w:before="40" w:line="300"/>
+              <w:spacing w:after="60" w:before="40" w:line="300" w:lineRule="auto"/>
             </w:pPr>
             <w:r>
               <w:rPr>
@@ -662,7 +662,7 @@
           </w:tcPr>
           <w:p>
             <w:pPr>
-              <w:spacing w:after="60" w:before="40" w:line="300"/>
+              <w:spacing w:after="60" w:before="40" w:line="300" w:lineRule="auto"/>
             </w:pPr>
             <w:r>
               <w:rPr>
@@ -687,7 +687,7 @@
           </w:tcPr>
           <w:p>
             <w:pPr>
-              <w:spacing w:after="60" w:before="40" w:line="300"/>
+              <w:spacing w:after="60" w:before="40" w:line="300" w:lineRule="auto"/>
             </w:pPr>
             <w:r>
               <w:rPr>
@@ -712,7 +712,7 @@
           </w:tcPr>
           <w:p>
             <w:pPr>
-              <w:spacing w:after="60" w:before="40" w:line="300"/>
+              <w:spacing w:after="60" w:before="40" w:line="300" w:lineRule="auto"/>
             </w:pPr>
             <w:r>
               <w:rPr>
@@ -737,7 +737,7 @@
           </w:tcPr>
           <w:p>
             <w:pPr>
-              <w:spacing w:after="60" w:before="40" w:line="300"/>
+              <w:spacing w:after="60" w:before="40" w:line="300" w:lineRule="auto"/>
             </w:pPr>
             <w:r>
               <w:rPr>
@@ -767,7 +767,7 @@
           </w:tcPr>
           <w:p>
             <w:pPr>
-              <w:spacing w:after="60" w:before="40" w:line="300"/>
+              <w:spacing w:after="60" w:before="40" w:line="300" w:lineRule="auto"/>
             </w:pPr>
             <w:r>
               <w:rPr>
@@ -792,7 +792,7 @@
           </w:tcPr>
           <w:p>
             <w:pPr>
-              <w:spacing w:after="60" w:before="40" w:line="300"/>
+              <w:spacing w:after="60" w:before="40" w:line="300" w:lineRule="auto"/>
             </w:pPr>
             <w:r>
               <w:rPr>
@@ -817,7 +817,7 @@
           </w:tcPr>
           <w:p>
             <w:pPr>
-              <w:spacing w:after="60" w:before="40" w:line="300"/>
+              <w:spacing w:after="60" w:before="40" w:line="300" w:lineRule="auto"/>
             </w:pPr>
             <w:r>
               <w:rPr>
@@ -842,7 +842,7 @@
           </w:tcPr>
           <w:p>
             <w:pPr>
-              <w:spacing w:after="60" w:before="40" w:line="300"/>
+              <w:spacing w:after="60" w:before="40" w:line="300" w:lineRule="auto"/>
             </w:pPr>
             <w:r>
               <w:rPr>
@@ -867,7 +867,7 @@
           </w:tcPr>
           <w:p>
             <w:pPr>
-              <w:spacing w:after="60" w:before="40" w:line="300"/>
+              <w:spacing w:after="60" w:before="40" w:line="300" w:lineRule="auto"/>
             </w:pPr>
             <w:r>
               <w:rPr>
@@ -897,7 +897,7 @@
           </w:tcPr>
           <w:p>
             <w:pPr>
-              <w:spacing w:after="60" w:before="40" w:line="300"/>
+              <w:spacing w:after="60" w:before="40" w:line="300" w:lineRule="auto"/>
             </w:pPr>
             <w:r>
               <w:rPr>
@@ -922,7 +922,7 @@
           </w:tcPr>
           <w:p>
             <w:pPr>
-              <w:spacing w:after="60" w:before="40" w:line="300"/>
+              <w:spacing w:after="60" w:before="40" w:line="300" w:lineRule="auto"/>
             </w:pPr>
             <w:r>
               <w:rPr>
@@ -947,7 +947,7 @@
           </w:tcPr>
           <w:p>
             <w:pPr>
-              <w:spacing w:after="60" w:before="40" w:line="300"/>
+              <w:spacing w:after="60" w:before="40" w:line="300" w:lineRule="auto"/>
             </w:pPr>
             <w:r>
               <w:rPr>
@@ -972,7 +972,7 @@
           </w:tcPr>
           <w:p>
             <w:pPr>
-              <w:spacing w:after="60" w:before="40" w:line="300"/>
+              <w:spacing w:after="60" w:before="40" w:line="300" w:lineRule="auto"/>
             </w:pPr>
             <w:r>
               <w:rPr>
@@ -997,7 +997,7 @@
           </w:tcPr>
           <w:p>
             <w:pPr>
-              <w:spacing w:after="60" w:before="40" w:line="300"/>
+              <w:spacing w:after="60" w:before="40" w:line="300" w:lineRule="auto"/>
             </w:pPr>
             <w:r>
               <w:rPr>
@@ -1027,7 +1027,7 @@
           </w:tcPr>
           <w:p>
             <w:pPr>
-              <w:spacing w:after="60" w:before="40" w:line="300"/>
+              <w:spacing w:after="60" w:before="40" w:line="300" w:lineRule="auto"/>
             </w:pPr>
             <w:r>
               <w:rPr>
@@ -1052,7 +1052,7 @@
           </w:tcPr>
           <w:p>
             <w:pPr>
-              <w:spacing w:after="60" w:before="40" w:line="300"/>
+              <w:spacing w:after="60" w:before="40" w:line="300" w:lineRule="auto"/>
             </w:pPr>
             <w:r>
               <w:rPr>
@@ -1077,7 +1077,7 @@
           </w:tcPr>
           <w:p>
             <w:pPr>
-              <w:spacing w:after="60" w:before="40" w:line="300"/>
+              <w:spacing w:after="60" w:before="40" w:line="300" w:lineRule="auto"/>
             </w:pPr>
             <w:r>
               <w:rPr>
@@ -1102,7 +1102,7 @@
           </w:tcPr>
           <w:p>
             <w:pPr>
-              <w:spacing w:after="60" w:before="40" w:line="300"/>
+              <w:spacing w:after="60" w:before="40" w:line="300" w:lineRule="auto"/>
             </w:pPr>
             <w:r>
               <w:rPr>
@@ -1127,7 +1127,7 @@
           </w:tcPr>
           <w:p>
             <w:pPr>
-              <w:spacing w:after="60" w:before="40" w:line="300"/>
+              <w:spacing w:after="60" w:before="40" w:line="300" w:lineRule="auto"/>
             </w:pPr>
             <w:r>
               <w:rPr>
@@ -1140,7 +1140,7 @@
           </w:p>
           <w:p>
             <w:pPr>
-              <w:spacing w:after="60" w:before="40" w:line="300"/>
+              <w:spacing w:after="60" w:before="40" w:line="300" w:lineRule="auto"/>
             </w:pPr>
             <w:r>
               <w:rPr>
@@ -1153,7 +1153,7 @@
           </w:p>
           <w:p>
             <w:pPr>
-              <w:spacing w:after="60" w:before="40" w:line="300"/>
+              <w:spacing w:after="60" w:before="40" w:line="300" w:lineRule="auto"/>
             </w:pPr>
             <w:r>
               <w:rPr>
@@ -1183,7 +1183,7 @@
           </w:tcPr>
           <w:p>
             <w:pPr>
-              <w:spacing w:after="60" w:before="40" w:line="300"/>
+              <w:spacing w:after="60" w:before="40" w:line="300" w:lineRule="auto"/>
             </w:pPr>
             <w:r>
               <w:rPr>
@@ -1210,7 +1210,7 @@
           </w:tcPr>
           <w:p>
             <w:pPr>
-              <w:spacing w:after="60" w:before="40" w:line="300"/>
+              <w:spacing w:after="60" w:before="40" w:line="300" w:lineRule="auto"/>
             </w:pPr>
             <w:r>
               <w:rPr>
@@ -1235,7 +1235,7 @@
           </w:tcPr>
           <w:p>
             <w:pPr>
-              <w:spacing w:after="60" w:before="40" w:line="300"/>
+              <w:spacing w:after="60" w:before="40" w:line="300" w:lineRule="auto"/>
             </w:pPr>
             <w:r>
               <w:rPr>
@@ -1262,7 +1262,7 @@
           </w:tcPr>
           <w:p>
             <w:pPr>
-              <w:spacing w:after="60" w:before="40" w:line="300"/>
+              <w:spacing w:after="60" w:before="40" w:line="300" w:lineRule="auto"/>
             </w:pPr>
             <w:r>
               <w:rPr>
@@ -1287,7 +1287,7 @@
           </w:tcPr>
           <w:p>
             <w:pPr>
-              <w:spacing w:after="60" w:before="40" w:line="300"/>
+              <w:spacing w:after="60" w:before="40" w:line="300" w:lineRule="auto"/>
             </w:pPr>
             <w:r>
               <w:rPr>
@@ -1304,7 +1304,7 @@
     <w:p>
       <w:pPr>
         <w:keepNext/>
-        <w:spacing w:after="80" w:before="120" w:line="300"/>
+        <w:spacing w:after="80" w:before="120" w:line="300" w:lineRule="auto"/>
       </w:pPr>
       <w:r>
         <w:rPr>
@@ -1352,7 +1352,7 @@
           </w:tcPr>
           <w:p>
             <w:pPr>
-              <w:spacing w:after="60" w:before="40" w:line="300"/>
+              <w:spacing w:after="60" w:before="40" w:line="300" w:lineRule="auto"/>
               <w:jc w:val="center"/>
             </w:pPr>
             <w:r>
@@ -1381,7 +1381,7 @@
           </w:tcPr>
           <w:p>
             <w:pPr>
-              <w:spacing w:after="60" w:before="40" w:line="300"/>
+              <w:spacing w:after="60" w:before="40" w:line="300" w:lineRule="auto"/>
               <w:jc w:val="center"/>
             </w:pPr>
             <w:r>
@@ -1410,7 +1410,7 @@
           </w:tcPr>
           <w:p>
             <w:pPr>
-              <w:spacing w:after="60" w:before="40" w:line="300"/>
+              <w:spacing w:after="60" w:before="40" w:line="300" w:lineRule="auto"/>
               <w:jc w:val="center"/>
             </w:pPr>
             <w:r>
@@ -1443,7 +1443,7 @@
           </w:tcPr>
           <w:p>
             <w:pPr>
-              <w:spacing w:after="60" w:before="40" w:line="300"/>
+              <w:spacing w:after="60" w:before="40" w:line="300" w:lineRule="auto"/>
             </w:pPr>
             <w:r>
               <w:rPr>
@@ -1468,7 +1468,7 @@
           </w:tcPr>
           <w:p>
             <w:pPr>
-              <w:spacing w:after="60" w:before="40" w:line="300"/>
+              <w:spacing w:after="60" w:before="40" w:line="300" w:lineRule="auto"/>
             </w:pPr>
             <w:r>
               <w:rPr>
@@ -1493,7 +1493,7 @@
           </w:tcPr>
           <w:p>
             <w:pPr>
-              <w:spacing w:after="60" w:before="40" w:line="300"/>
+              <w:spacing w:after="60" w:before="40" w:line="300" w:lineRule="auto"/>
             </w:pPr>
             <w:r>
               <w:rPr>
@@ -1523,7 +1523,7 @@
           </w:tcPr>
           <w:p>
             <w:pPr>
-              <w:spacing w:after="60" w:before="40" w:line="300"/>
+              <w:spacing w:after="60" w:before="40" w:line="300" w:lineRule="auto"/>
             </w:pPr>
             <w:r>
               <w:rPr>
@@ -1548,7 +1548,7 @@
           </w:tcPr>
           <w:p>
             <w:pPr>
-              <w:spacing w:after="60" w:before="40" w:line="300"/>
+              <w:spacing w:after="60" w:before="40" w:line="300" w:lineRule="auto"/>
             </w:pPr>
             <w:r>
               <w:rPr>
@@ -1573,7 +1573,7 @@
           </w:tcPr>
           <w:p>
             <w:pPr>
-              <w:spacing w:after="60" w:before="40" w:line="300"/>
+              <w:spacing w:after="60" w:before="40" w:line="300" w:lineRule="auto"/>
             </w:pPr>
             <w:r>
               <w:rPr>
@@ -1603,7 +1603,7 @@
           </w:tcPr>
           <w:p>
             <w:pPr>
-              <w:spacing w:after="60" w:before="40" w:line="300"/>
+              <w:spacing w:after="60" w:before="40" w:line="300" w:lineRule="auto"/>
             </w:pPr>
             <w:r>
               <w:rPr>
@@ -1628,7 +1628,7 @@
           </w:tcPr>
           <w:p>
             <w:pPr>
-              <w:spacing w:after="60" w:before="40" w:line="300"/>
+              <w:spacing w:after="60" w:before="40" w:line="300" w:lineRule="auto"/>
             </w:pPr>
             <w:r>
               <w:rPr>
@@ -1653,7 +1653,7 @@
           </w:tcPr>
           <w:p>
             <w:pPr>
-              <w:spacing w:after="60" w:before="40" w:line="300"/>
+              <w:spacing w:after="60" w:before="40" w:line="300" w:lineRule="auto"/>
             </w:pPr>
             <w:r>
               <w:rPr>
@@ -1683,7 +1683,7 @@
           </w:tcPr>
           <w:p>
             <w:pPr>
-              <w:spacing w:after="60" w:before="40" w:line="300"/>
+              <w:spacing w:after="60" w:before="40" w:line="300" w:lineRule="auto"/>
             </w:pPr>
             <w:r>
               <w:rPr>
@@ -1708,7 +1708,7 @@
           </w:tcPr>
           <w:p>
             <w:pPr>
-              <w:spacing w:after="60" w:before="40" w:line="300"/>
+              <w:spacing w:after="60" w:before="40" w:line="300" w:lineRule="auto"/>
             </w:pPr>
             <w:r>
               <w:rPr>
@@ -1733,7 +1733,7 @@
           </w:tcPr>
           <w:p>
             <w:pPr>
-              <w:spacing w:after="60" w:before="40" w:line="300"/>
+              <w:spacing w:after="60" w:before="40" w:line="300" w:lineRule="auto"/>
             </w:pPr>
             <w:r>
               <w:rPr>
@@ -1763,7 +1763,7 @@
           </w:tcPr>
           <w:p>
             <w:pPr>
-              <w:spacing w:after="60" w:before="40" w:line="300"/>
+              <w:spacing w:after="60" w:before="40" w:line="300" w:lineRule="auto"/>
             </w:pPr>
             <w:r>
               <w:rPr>
@@ -1788,7 +1788,7 @@
           </w:tcPr>
           <w:p>
             <w:pPr>
-              <w:spacing w:after="60" w:before="40" w:line="300"/>
+              <w:spacing w:after="60" w:before="40" w:line="300" w:lineRule="auto"/>
             </w:pPr>
             <w:r>
               <w:rPr>
@@ -1813,7 +1813,7 @@
           </w:tcPr>
           <w:p>
             <w:pPr>
-              <w:spacing w:after="60" w:before="40" w:line="300"/>
+              <w:spacing w:after="60" w:before="40" w:line="300" w:lineRule="auto"/>
             </w:pPr>
             <w:r>
               <w:rPr>
@@ -1843,7 +1843,7 @@
           </w:tcPr>
           <w:p>
             <w:pPr>
-              <w:spacing w:after="60" w:before="40" w:line="300"/>
+              <w:spacing w:after="60" w:before="40" w:line="300" w:lineRule="auto"/>
             </w:pPr>
             <w:r>
               <w:rPr>
@@ -1868,7 +1868,7 @@
           </w:tcPr>
           <w:p>
             <w:pPr>
-              <w:spacing w:after="60" w:before="40" w:line="300"/>
+              <w:spacing w:after="60" w:before="40" w:line="300" w:lineRule="auto"/>
             </w:pPr>
             <w:r>
               <w:rPr>
@@ -1893,7 +1893,7 @@
           </w:tcPr>
           <w:p>
             <w:pPr>
-              <w:spacing w:after="60" w:before="40" w:line="300"/>
+              <w:spacing w:after="60" w:before="40" w:line="300" w:lineRule="auto"/>
             </w:pPr>
             <w:r>
               <w:rPr>
@@ -1923,7 +1923,7 @@
           </w:tcPr>
           <w:p>
             <w:pPr>
-              <w:spacing w:after="60" w:before="40" w:line="300"/>
+              <w:spacing w:after="60" w:before="40" w:line="300" w:lineRule="auto"/>
             </w:pPr>
             <w:r>
               <w:rPr>
@@ -1948,7 +1948,7 @@
           </w:tcPr>
           <w:p>
             <w:pPr>
-              <w:spacing w:after="60" w:before="40" w:line="300"/>
+              <w:spacing w:after="60" w:before="40" w:line="300" w:lineRule="auto"/>
             </w:pPr>
             <w:r>
               <w:rPr>
@@ -1973,7 +1973,7 @@
           </w:tcPr>
           <w:p>
             <w:pPr>
-              <w:spacing w:after="60" w:before="40" w:line="300"/>
+              <w:spacing w:after="60" w:before="40" w:line="300" w:lineRule="auto"/>
             </w:pPr>
             <w:r>
               <w:rPr>
@@ -2003,7 +2003,7 @@
           </w:tcPr>
           <w:p>
             <w:pPr>
-              <w:spacing w:after="60" w:before="40" w:line="300"/>
+              <w:spacing w:after="60" w:before="40" w:line="300" w:lineRule="auto"/>
             </w:pPr>
             <w:r>
               <w:rPr>
@@ -2028,7 +2028,7 @@
           </w:tcPr>
           <w:p>
             <w:pPr>
-              <w:spacing w:after="60" w:before="40" w:line="300"/>
+              <w:spacing w:after="60" w:before="40" w:line="300" w:lineRule="auto"/>
             </w:pPr>
             <w:r>
               <w:rPr>
@@ -2053,7 +2053,7 @@
           </w:tcPr>
           <w:p>
             <w:pPr>
-              <w:spacing w:after="60" w:before="40" w:line="300"/>
+              <w:spacing w:after="60" w:before="40" w:line="300" w:lineRule="auto"/>
             </w:pPr>
             <w:r>
               <w:rPr>
@@ -2083,7 +2083,7 @@
           </w:tcPr>
           <w:p>
             <w:pPr>
-              <w:spacing w:after="60" w:before="40" w:line="300"/>
+              <w:spacing w:after="60" w:before="40" w:line="300" w:lineRule="auto"/>
             </w:pPr>
             <w:r>
               <w:rPr>
@@ -2108,7 +2108,7 @@
           </w:tcPr>
           <w:p>
             <w:pPr>
-              <w:spacing w:after="60" w:before="40" w:line="300"/>
+              <w:spacing w:after="60" w:before="40" w:line="300" w:lineRule="auto"/>
             </w:pPr>
             <w:r>
               <w:rPr>
@@ -2133,7 +2133,7 @@
           </w:tcPr>
           <w:p>
             <w:pPr>
-              <w:spacing w:after="60" w:before="40" w:line="300"/>
+              <w:spacing w:after="60" w:before="40" w:line="300" w:lineRule="auto"/>
             </w:pPr>
             <w:r>
               <w:rPr>
@@ -2163,7 +2163,7 @@
           </w:tcPr>
           <w:p>
             <w:pPr>
-              <w:spacing w:after="60" w:before="40" w:line="300"/>
+              <w:spacing w:after="60" w:before="40" w:line="300" w:lineRule="auto"/>
             </w:pPr>
             <w:r>
               <w:rPr>
@@ -2188,7 +2188,7 @@
           </w:tcPr>
           <w:p>
             <w:pPr>
-              <w:spacing w:after="60" w:before="40" w:line="300"/>
+              <w:spacing w:after="60" w:before="40" w:line="300" w:lineRule="auto"/>
             </w:pPr>
             <w:r>
               <w:rPr>
@@ -2213,7 +2213,7 @@
           </w:tcPr>
           <w:p>
             <w:pPr>
-              <w:spacing w:after="60" w:before="40" w:line="300"/>
+              <w:spacing w:after="60" w:before="40" w:line="300" w:lineRule="auto"/>
             </w:pPr>
             <w:r>
               <w:rPr>
@@ -2243,7 +2243,7 @@
           </w:tcPr>
           <w:p>
             <w:pPr>
-              <w:spacing w:after="60" w:before="40" w:line="300"/>
+              <w:spacing w:after="60" w:before="40" w:line="300" w:lineRule="auto"/>
             </w:pPr>
             <w:r>
               <w:rPr>
@@ -2268,7 +2268,7 @@
           </w:tcPr>
           <w:p>
             <w:pPr>
-              <w:spacing w:after="60" w:before="40" w:line="300"/>
+              <w:spacing w:after="60" w:before="40" w:line="300" w:lineRule="auto"/>
             </w:pPr>
             <w:r>
               <w:rPr>
@@ -2293,7 +2293,7 @@
           </w:tcPr>
           <w:p>
             <w:pPr>
-              <w:spacing w:after="60" w:before="40" w:line="300"/>
+              <w:spacing w:after="60" w:before="40" w:line="300" w:lineRule="auto"/>
             </w:pPr>
             <w:r>
               <w:rPr>
@@ -2323,7 +2323,7 @@
           </w:tcPr>
           <w:p>
             <w:pPr>
-              <w:spacing w:after="60" w:before="40" w:line="300"/>
+              <w:spacing w:after="60" w:before="40" w:line="300" w:lineRule="auto"/>
             </w:pPr>
             <w:r>
               <w:rPr>
@@ -2348,7 +2348,7 @@
           </w:tcPr>
           <w:p>
             <w:pPr>
-              <w:spacing w:after="60" w:before="40" w:line="300"/>
+              <w:spacing w:after="60" w:before="40" w:line="300" w:lineRule="auto"/>
             </w:pPr>
             <w:r>
               <w:rPr>
@@ -2373,7 +2373,7 @@
           </w:tcPr>
           <w:p>
             <w:pPr>
-              <w:spacing w:after="60" w:before="40" w:line="300"/>
+              <w:spacing w:after="60" w:before="40" w:line="300" w:lineRule="auto"/>
             </w:pPr>
             <w:r>
               <w:rPr>
@@ -2389,7 +2389,7 @@
     </w:tbl>
     <w:p>
       <w:pPr>
-        <w:spacing w:after="60" w:before="40" w:line="300"/>
+        <w:spacing w:after="60" w:before="40" w:line="300" w:lineRule="auto"/>
       </w:pPr>
       <w:r>
         <w:rPr>
@@ -2403,7 +2403,7 @@
     <w:p>
       <w:pPr>
         <w:keepNext/>
-        <w:spacing w:after="80" w:before="120" w:line="300"/>
+        <w:spacing w:after="80" w:before="120" w:line="300" w:lineRule="auto"/>
       </w:pPr>
       <w:r>
         <w:rPr>
@@ -2418,7 +2418,7 @@
     </w:p>
     <w:p>
       <w:pPr>
-        <w:spacing w:after="60" w:before="40" w:line="300"/>
+        <w:spacing w:after="60" w:before="40" w:line="300" w:lineRule="auto"/>
       </w:pPr>
       <w:r>
         <w:rPr>
@@ -2432,7 +2432,7 @@
     <w:p>
       <w:pPr>
         <w:keepNext/>
-        <w:spacing w:after="80" w:before="120" w:line="300"/>
+        <w:spacing w:after="80" w:before="120" w:line="300" w:lineRule="auto"/>
       </w:pPr>
       <w:r>
         <w:rPr>
@@ -2447,7 +2447,7 @@
     </w:p>
     <w:p>
       <w:pPr>
-        <w:spacing w:after="60" w:before="40" w:line="300"/>
+        <w:spacing w:after="60" w:before="40" w:line="300" w:lineRule="auto"/>
         <w:ind w:left="284"/>
       </w:pPr>
       <w:r>
@@ -2469,7 +2469,7 @@
     </w:p>
     <w:p>
       <w:pPr>
-        <w:spacing w:after="60" w:before="40" w:line="300"/>
+        <w:spacing w:after="60" w:before="40" w:line="300" w:lineRule="auto"/>
         <w:ind w:left="284"/>
       </w:pPr>
       <w:r>
@@ -2491,7 +2491,7 @@
     </w:p>
     <w:p>
       <w:pPr>
-        <w:spacing w:after="60" w:before="40" w:line="300"/>
+        <w:spacing w:after="60" w:before="40" w:line="300" w:lineRule="auto"/>
         <w:ind w:left="284"/>
       </w:pPr>
       <w:r>
@@ -2513,7 +2513,7 @@
     </w:p>
     <w:p>
       <w:pPr>
-        <w:spacing w:after="60" w:before="40" w:line="300"/>
+        <w:spacing w:after="60" w:before="40" w:line="300" w:lineRule="auto"/>
         <w:ind w:left="284"/>
       </w:pPr>
       <w:r>
@@ -2535,7 +2535,7 @@
     </w:p>
     <w:p>
       <w:pPr>
-        <w:spacing w:after="60" w:before="40" w:line="300"/>
+        <w:spacing w:after="60" w:before="40" w:line="300" w:lineRule="auto"/>
         <w:ind w:left="284"/>
       </w:pPr>
       <w:r>
@@ -2557,7 +2557,7 @@
     </w:p>
     <w:p>
       <w:pPr>
-        <w:spacing w:after="60" w:before="40" w:line="300"/>
+        <w:spacing w:after="60" w:before="40" w:line="300" w:lineRule="auto"/>
         <w:ind w:left="284"/>
       </w:pPr>
       <w:r>
@@ -2579,7 +2579,7 @@
     </w:p>
     <w:p>
       <w:pPr>
-        <w:spacing w:after="60" w:before="40" w:line="300"/>
+        <w:spacing w:after="60" w:before="40" w:line="300" w:lineRule="auto"/>
         <w:ind w:left="284"/>
       </w:pPr>
       <w:r>
@@ -2601,8 +2601,30 @@
     </w:p>
     <w:p>
       <w:pPr>
+        <w:spacing w:after="60" w:before="40" w:line="300" w:lineRule="auto"/>
+        <w:ind w:left="284"/>
+      </w:pPr>
+      <w:r>
+        <w:rPr>
+          <w:rFonts w:ascii="Times New Roman" w:cs="Times New Roman" w:eastAsia="Times New Roman" w:hAnsi="Times New Roman"/>
+          <w:sz w:val="26"/>
+          <w:szCs w:val="26"/>
+        </w:rPr>
+        <w:t xml:space="preserve">– </w:t>
+      </w:r>
+      <w:r>
+        <w:rPr>
+          <w:rFonts w:ascii="Times New Roman" w:cs="Times New Roman" w:eastAsia="Times New Roman" w:hAnsi="Times New Roman"/>
+          <w:sz w:val="26"/>
+          <w:szCs w:val="26"/>
+        </w:rPr>
+        <w:t xml:space="preserve">Giữ 2 tranh minh hoạ từ vựng (fresh, join) của bản gốc ở HD2; Bài 5 được tổ chức theo đúng hình thức SGK (mỗi HS nêu 2 hoạt động, quyết định Good/Bad + lý do) rồi mở rộng thành kế hoạch Same/Different.</w:t>
+      </w:r>
+    </w:p>
+    <w:p>
+      <w:pPr>
         <w:keepNext/>
-        <w:spacing w:after="80" w:before="120" w:line="300"/>
+        <w:spacing w:after="80" w:before="120" w:line="300" w:lineRule="auto"/>
       </w:pPr>
       <w:r>
         <w:rPr>
@@ -2617,7 +2639,7 @@
     </w:p>
     <w:p>
       <w:pPr>
-        <w:spacing w:after="60" w:before="40" w:line="300"/>
+        <w:spacing w:after="60" w:before="40" w:line="300" w:lineRule="auto"/>
         <w:ind w:left="284"/>
       </w:pPr>
       <w:r>
@@ -2635,58 +2657,12 @@
           <w:sz w:val="26"/>
           <w:szCs w:val="26"/>
         </w:rPr>
-        <w:t xml:space="preserve">Yêu cầu cần đạt ở trên được viết từ mục tiêu bản gốc + nội dung SGK; chưa đối chiếu được văn bản PPCT/Phụ lục 1 chính thức của trường — GV kiểm tra lại.</w:t>
+        <w:t xml:space="preserve">Đáp án Bài 2–4 và mô tả Bài 5 đã đối chiếu qua kết quả tìm kiếm (trùng với bản gốc của GV); yêu cầu cần đạt viết theo định hướng chương trình Tiếng Anh 2018 nhưng chưa mở được văn bản chương trình gốc — GV đối chiếu Phụ lục 1/PPCT của trường.</w:t>
       </w:r>
     </w:p>
     <w:p>
       <w:pPr>
-        <w:spacing w:after="60" w:before="40" w:line="300"/>
-        <w:ind w:left="284"/>
-      </w:pPr>
-      <w:r>
-        <w:rPr>
-          <w:rFonts w:ascii="Times New Roman" w:cs="Times New Roman" w:eastAsia="Times New Roman" w:hAnsi="Times New Roman"/>
-          <w:sz w:val="26"/>
-          <w:szCs w:val="26"/>
-        </w:rPr>
-        <w:t xml:space="preserve">– </w:t>
-      </w:r>
-      <w:r>
-        <w:rPr>
-          <w:rFonts w:ascii="Times New Roman" w:cs="Times New Roman" w:eastAsia="Times New Roman" w:hAnsi="Times New Roman"/>
-          <w:color w:val="C00000"/>
-          <w:sz w:val="26"/>
-          <w:szCs w:val="26"/>
-        </w:rPr>
-        <w:t xml:space="preserve">Nguồn tra cứu mô tả Bài 5 là trò chơi 'Good/bad for health?', bản gốc ghi 'Survey' — GV đối chiếu hình thức Bài 5 trong SGK tr.19.</w:t>
-      </w:r>
-    </w:p>
-    <w:p>
-      <w:pPr>
-        <w:spacing w:after="60" w:before="40" w:line="300"/>
-        <w:ind w:left="284"/>
-      </w:pPr>
-      <w:r>
-        <w:rPr>
-          <w:rFonts w:ascii="Times New Roman" w:cs="Times New Roman" w:eastAsia="Times New Roman" w:hAnsi="Times New Roman"/>
-          <w:sz w:val="26"/>
-          <w:szCs w:val="26"/>
-        </w:rPr>
-        <w:t xml:space="preserve">– </w:t>
-      </w:r>
-      <w:r>
-        <w:rPr>
-          <w:rFonts w:ascii="Times New Roman" w:cs="Times New Roman" w:eastAsia="Times New Roman" w:hAnsi="Times New Roman"/>
-          <w:color w:val="C00000"/>
-          <w:sz w:val="26"/>
-          <w:szCs w:val="26"/>
-        </w:rPr>
-        <w:t xml:space="preserve">Nội dung phương án B của Bài 2 lấy theo đáp án bản gốc — GV đối chiếu SGK tr.19.</w:t>
-      </w:r>
-    </w:p>
-    <w:p>
-      <w:pPr>
-        <w:spacing w:after="60" w:before="300" w:line="300"/>
+        <w:spacing w:after="60" w:before="300" w:line="300" w:lineRule="auto"/>
       </w:pPr>
       <w:r>
         <w:rPr>

</xml_diff>

<commit_message>
KHBD ngắn gọn: giới hạn độ dài khi soạn, bố cục gọn, không lặp nội dung
- System prompt: mục VĂN PHONG NGẮN GỌN — giới hạn số từ từng trường, số mục mỗi phần, cấm lặp nội dung giữa nội dung/tổ chức/mục tiêu
- Bố cục Word + bản xem trước: bìa 1 dòng thông tin; thiết bị 2 dòng GV/HS; bỏ mục AI khi không dùng; nhãn B1–B4 ngắn; mục tiêu + mã + phút gộp một ô; khó khăn dạng gạch đầu dòng; phụ lục chỉ còn YCCĐ + điểm cần kiểm tra
- Mẫu TA7 viết lại theo giới hạn mới: 1.960 chữ / 9 trang (trước 4.416 / 13), vẫn đạt trọn phần kiểm tra theo quy tắc

Co-Authored-By: Claude Opus 5.5 <noreply@anthropic.com>
Claude-Session: https://claude.ai/code/session_013rNEKs6tcmtsXtauscuotv
</commit_message>
<xml_diff>
--- a/samples/output/TA7_Unit2_Lesson1_BaoCao.docx
+++ b/samples/output/TA7_Unit2_Lesson1_BaoCao.docx
@@ -1476,7 +1476,7 @@
                 <w:sz w:val="24"/>
                 <w:szCs w:val="24"/>
               </w:rPr>
-              <w:t xml:space="preserve">HS hiểu nghĩa, phát âm đúng và dùng được trong câu ít nhất 6 từ/cụm từ của bài: popular, fresh, join, sunburn, suncream, lunch box, boating, cycling, countryside.</w:t>
+              <w:t xml:space="preserve">Hiểu, phát âm, dùng đúng ≥6 từ: popular, fresh, join, sunburn, suncream, lunch box, boating, cycling.</w:t>
             </w:r>
           </w:p>
         </w:tc>
@@ -1556,7 +1556,7 @@
                 <w:sz w:val="24"/>
                 <w:szCs w:val="24"/>
               </w:rPr>
-              <w:t xml:space="preserve">HS nhận biết và nói được về các hoạt động hằng ngày, xác định hoạt động nào tốt/không tốt cho sức khoẻ và giải thích ngắn gọn lý do.</w:t>
+              <w:t xml:space="preserve">Nói được hoạt động hằng ngày tốt/không tốt cho sức khoẻ, có lý do.</w:t>
             </w:r>
           </w:p>
         </w:tc>
@@ -1636,7 +1636,7 @@
                 <w:sz w:val="24"/>
                 <w:szCs w:val="24"/>
               </w:rPr>
-              <w:t xml:space="preserve">Giao tiếp và hợp tác: làm việc cặp/nhóm theo vai được phân công, hoàn thành sản phẩm nhóm đúng thời gian, lắng nghe và phản hồi ý kiến của bạn.</w:t>
+              <w:t xml:space="preserve">Hợp tác nhóm theo vai, hoàn thành sản phẩm đúng giờ.</w:t>
             </w:r>
           </w:p>
         </w:tc>
@@ -1716,7 +1716,7 @@
                 <w:sz w:val="24"/>
                 <w:szCs w:val="24"/>
               </w:rPr>
-              <w:t xml:space="preserve">Giải quyết vấn đề và sáng tạo: chọn một phương án kế hoạch sống khoẻ và đề xuất ít nhất 3 lời khuyên phù hợp với kết quả khảo sát của nhóm.</w:t>
+              <w:t xml:space="preserve">Chọn phương án, đề xuất ≥3 lời khuyên phù hợp kết quả khảo sát.</w:t>
             </w:r>
           </w:p>
         </w:tc>
@@ -1796,7 +1796,7 @@
                 <w:sz w:val="24"/>
                 <w:szCs w:val="24"/>
               </w:rPr>
-              <w:t xml:space="preserve">Nghe – đọc: nghe và đọc hội thoại Bài 1, trả lời đúng câu hỏi Bài 2 và ít nhất 8/10 câu của Bài 3–4.</w:t>
+              <w:t xml:space="preserve">Nghe – đọc hội thoại, làm đúng Bài 2 và ≥8/10 câu Bài 3–4.</w:t>
             </w:r>
           </w:p>
         </w:tc>
@@ -1876,7 +1876,7 @@
                 <w:sz w:val="24"/>
                 <w:szCs w:val="24"/>
               </w:rPr>
-              <w:t xml:space="preserve">Nói: hỏi – đáp khảo sát (How often do you…? Is it good or bad for your health? Why?) và trình bày kế hoạch của nhóm trong khoảng 1 phút bằng tiếng Anh.</w:t>
+              <w:t xml:space="preserve">Hỏi – đáp khảo sát và trình bày kế hoạch 1 phút bằng tiếng Anh.</w:t>
             </w:r>
           </w:p>
         </w:tc>
@@ -1956,7 +1956,7 @@
                 <w:sz w:val="24"/>
                 <w:szCs w:val="24"/>
               </w:rPr>
-              <w:t xml:space="preserve">Chăm chỉ: tích cực tham gia các hoạt động học, có ý thức rèn luyện thói quen sống lành mạnh hằng ngày.</w:t>
+              <w:t xml:space="preserve">Chăm chỉ: tích cực học, có ý thức rèn thói quen sống lành mạnh.</w:t>
             </w:r>
           </w:p>
         </w:tc>
@@ -2036,7 +2036,7 @@
                 <w:sz w:val="24"/>
                 <w:szCs w:val="24"/>
               </w:rPr>
-              <w:t xml:space="preserve">Thói quen 3 – Ưu tiên điều quan trọng (Công cụ Ưu tiên kết hợp ẩn dụ "Hòn đá lớn")</w:t>
+              <w:t xml:space="preserve">Thói quen 3 – Ưu tiên điều quan trọng (Công cụ Ưu tiên – "Hòn đá lớn")</w:t>
             </w:r>
           </w:p>
         </w:tc>
@@ -2196,7 +2196,7 @@
                 <w:sz w:val="24"/>
                 <w:szCs w:val="24"/>
               </w:rPr>
-              <w:t xml:space="preserve">Nhóm tự chọn 1 trong 3 phương án kế hoạch sống khoẻ và tự quyết định cách trình bày poster (bảng, sơ đồ, tranh vẽ).</w:t>
+              <w:t xml:space="preserve">Nhóm tự chọn phương án và hình thức poster.</w:t>
             </w:r>
           </w:p>
         </w:tc>
@@ -2276,7 +2276,7 @@
                 <w:sz w:val="24"/>
                 <w:szCs w:val="24"/>
               </w:rPr>
-              <w:t xml:space="preserve">HS giữ vai trò điều phối (Leader) và cùng nhóm lập thứ tự công việc trước khi bắt tay làm sản phẩm.</w:t>
+              <w:t xml:space="preserve">HS điều phối nhóm, tự lập thứ tự công việc.</w:t>
             </w:r>
           </w:p>
         </w:tc>
@@ -2356,7 +2356,7 @@
                 <w:sz w:val="24"/>
                 <w:szCs w:val="24"/>
               </w:rPr>
-              <w:t xml:space="preserve">HS tự đánh giá và đánh giá chéo poster theo rubric R1; Reporter của nhóm trình bày và trả lời câu hỏi của bạn.</w:t>
+              <w:t xml:space="preserve">HS tự/đồng đánh giá theo R1; Reporter trình bày, trả lời câu hỏi.</w:t>
             </w:r>
           </w:p>
         </w:tc>
@@ -2464,7 +2464,7 @@
           <w:sz w:val="26"/>
           <w:szCs w:val="26"/>
         </w:rPr>
-        <w:t xml:space="preserve">Chuyển tiến trình PPP sang tiến trình 5 bước 4PP (Làm rõ kỳ vọng → Thực hành → Báo cáo đánh giá → Chiêm nghiệm → Củng cố) với phương pháp Same/Different, giữ nguyên toàn bộ ngữ liệu, bài tập và đáp án của bản gốc.</w:t>
+        <w:t xml:space="preserve">Chuyển PPP sang 5 bước 4PP, phương pháp Same/Different.</w:t>
       </w:r>
     </w:p>
     <w:p>
@@ -2486,7 +2486,7 @@
           <w:sz w:val="26"/>
           <w:szCs w:val="26"/>
         </w:rPr>
-        <w:t xml:space="preserve">Bổ sung mục tiêu TLIM (Thói quen 3 – Ưu tiên điều quan trọng, công cụ Ưu tiên/"Hòn đá lớn") và Trao quyền (TQ1–TQ3, đáp ứng 6/6 tiêu chí) — bản gốc chưa có (Bước 1, Bước 6).</w:t>
+        <w:t xml:space="preserve">Thêm TLIM, Trao quyền, Chiêm nghiệm, rubric, câu hỏi định hướng.</w:t>
       </w:r>
     </w:p>
     <w:p>
@@ -2508,7 +2508,7 @@
           <w:sz w:val="26"/>
           <w:szCs w:val="26"/>
         </w:rPr>
-        <w:t xml:space="preserve">Bổ sung hoạt động Chiêm nghiệm (bản gốc thiếu — lỗi P1) với câu hỏi chạm vào Thói quen 3 và giá trị Trách nhiệm (Bước 7.D2).</w:t>
+        <w:t xml:space="preserve">Sửa thời lượng 36 → 45 phút; HS hoạt động ~78%.</w:t>
       </w:r>
     </w:p>
     <w:p>
@@ -2530,7 +2530,7 @@
           <w:sz w:val="26"/>
           <w:szCs w:val="26"/>
         </w:rPr>
-        <w:t xml:space="preserve">Bổ sung bộ câu hỏi định hướng theo khung Same/Different và rubric R1 công bố đầu tiết (bản gốc thiếu — Bước 1).</w:t>
+        <w:t xml:space="preserve">Thêm phân vai, 2 điểm kiểm tra giữa bài.</w:t>
       </w:r>
     </w:p>
     <w:p>
@@ -2552,73 +2552,7 @@
           <w:sz w:val="26"/>
           <w:szCs w:val="26"/>
         </w:rPr>
-        <w:t xml:space="preserve">Phân bổ lại thời gian: bản gốc ghi tổng 36 phút (2 hoạt động không ghi phút) → nay đủ 45 phút, HS hoạt động ~76% (Bước 4, Bước 7.D1).</w:t>
-      </w:r>
-    </w:p>
-    <w:p>
-      <w:pPr>
-        <w:spacing w:after="60" w:before="40" w:line="300" w:lineRule="auto"/>
-        <w:ind w:left="284"/>
-      </w:pPr>
-      <w:r>
-        <w:rPr>
-          <w:rFonts w:ascii="Times New Roman" w:cs="Times New Roman" w:eastAsia="Times New Roman" w:hAnsi="Times New Roman"/>
-          <w:sz w:val="26"/>
-          <w:szCs w:val="26"/>
-        </w:rPr>
-        <w:t xml:space="preserve">– </w:t>
-      </w:r>
-      <w:r>
-        <w:rPr>
-          <w:rFonts w:ascii="Times New Roman" w:cs="Times New Roman" w:eastAsia="Times New Roman" w:hAnsi="Times New Roman"/>
-          <w:sz w:val="26"/>
-          <w:szCs w:val="26"/>
-        </w:rPr>
-        <w:t xml:space="preserve">Bổ sung phân vai trong nhóm/cặp và 2 điểm kiểm tra mức hiểu giữa bài bằng bảng con (Bước 7.D1).</w:t>
-      </w:r>
-    </w:p>
-    <w:p>
-      <w:pPr>
-        <w:spacing w:after="60" w:before="40" w:line="300" w:lineRule="auto"/>
-        <w:ind w:left="284"/>
-      </w:pPr>
-      <w:r>
-        <w:rPr>
-          <w:rFonts w:ascii="Times New Roman" w:cs="Times New Roman" w:eastAsia="Times New Roman" w:hAnsi="Times New Roman"/>
-          <w:sz w:val="26"/>
-          <w:szCs w:val="26"/>
-        </w:rPr>
-        <w:t xml:space="preserve">– </w:t>
-      </w:r>
-      <w:r>
-        <w:rPr>
-          <w:rFonts w:ascii="Times New Roman" w:cs="Times New Roman" w:eastAsia="Times New Roman" w:hAnsi="Times New Roman"/>
-          <w:sz w:val="26"/>
-          <w:szCs w:val="26"/>
-        </w:rPr>
-        <w:t xml:space="preserve">Viết lại mục tiêu theo động từ đo lường được và gắn mã để đối chiếu mục tiêu ↔ hoạt động (Bước 5).</w:t>
-      </w:r>
-    </w:p>
-    <w:p>
-      <w:pPr>
-        <w:spacing w:after="60" w:before="40" w:line="300" w:lineRule="auto"/>
-        <w:ind w:left="284"/>
-      </w:pPr>
-      <w:r>
-        <w:rPr>
-          <w:rFonts w:ascii="Times New Roman" w:cs="Times New Roman" w:eastAsia="Times New Roman" w:hAnsi="Times New Roman"/>
-          <w:sz w:val="26"/>
-          <w:szCs w:val="26"/>
-        </w:rPr>
-        <w:t xml:space="preserve">– </w:t>
-      </w:r>
-      <w:r>
-        <w:rPr>
-          <w:rFonts w:ascii="Times New Roman" w:cs="Times New Roman" w:eastAsia="Times New Roman" w:hAnsi="Times New Roman"/>
-          <w:sz w:val="26"/>
-          <w:szCs w:val="26"/>
-        </w:rPr>
-        <w:t xml:space="preserve">Giữ 2 tranh minh hoạ từ vựng (fresh, join) của bản gốc ở HD2; Bài 5 được tổ chức theo đúng hình thức SGK (mỗi HS nêu 2 hoạt động, quyết định Good/Bad + lý do) rồi mở rộng thành kế hoạch Same/Different.</w:t>
+        <w:t xml:space="preserve">Giữ nguyên ngữ liệu, đáp án, 2 tranh gốc.</w:t>
       </w:r>
     </w:p>
     <w:p>
@@ -2657,7 +2591,7 @@
           <w:sz w:val="26"/>
           <w:szCs w:val="26"/>
         </w:rPr>
-        <w:t xml:space="preserve">Đáp án Bài 2–4 và mô tả Bài 5 đã đối chiếu qua kết quả tìm kiếm (trùng với bản gốc của GV); yêu cầu cần đạt viết theo định hướng chương trình Tiếng Anh 2018 nhưng chưa mở được văn bản chương trình gốc — GV đối chiếu Phụ lục 1/PPCT của trường.</w:t>
+        <w:t xml:space="preserve">YCCĐ chưa đối chiếu Phụ lục 1/PPCT của trường.</w:t>
       </w:r>
     </w:p>
     <w:p>
@@ -2672,7 +2606,7 @@
           <w:sz w:val="22"/>
           <w:szCs w:val="22"/>
         </w:rPr>
-        <w:t xml:space="preserve">Người chấm: Hệ thống hỗ trợ (AI + bộ kiểm tra quy tắc) — TTCM xác nhận: ……………………   Ngày: 6/10/2026</w:t>
+        <w:t xml:space="preserve">Người chấm: Hệ thống hỗ trợ (AI + bộ kiểm tra quy tắc) — TTCM xác nhận: ……………………   Ngày: 7/10/2026</w:t>
       </w:r>
     </w:p>
     <w:sectPr>

</xml_diff>

<commit_message>
Thêm mục tiêu Active Learning (I.6) và highlight minh chứng trong KHBD
- Schema: muc_tieu.active_learning (ACT1, ACT2), bắt buộc gắn vào hoạt động thực hiện (Bước 5)
- Bộ kiểm tra: thiếu mục tiêu AL → P2; mục tiêu ACT không có hoạt động thực hiện → P1
- active-learning.js: minh chứng tính từ tiến trình (tỉ lệ HS hoạt động, thời lượng GV giảng, nhóm phân vai, kiểm tra giữa bài, mức ICAP)
- Word + bản xem trước: mục 6. Active Learning kèm bảng minh chứng ✓/✗; thẻ highlight vàng 'Active Learning' ở từng hoạt động
- Prompt: quy định cách viết mục tiêu Active Learning theo Bước 7.D1 + ICAP; 27 kiểm thử

Co-Authored-By: Claude Opus 5.5 <noreply@anthropic.com>
Claude-Session: https://claude.ai/code/session_013rNEKs6tcmtsXtauscuotv
</commit_message>
<xml_diff>
--- a/samples/output/TA7_Unit2_Lesson1_BaoCao.docx
+++ b/samples/output/TA7_Unit2_Lesson1_BaoCao.docx
@@ -1982,6 +1982,166 @@
                 <w:szCs w:val="24"/>
               </w:rPr>
               <w:t xml:space="preserve">HD5, HD7</w:t>
+            </w:r>
+          </w:p>
+        </w:tc>
+      </w:tr>
+      <w:tr>
+        <w:trPr>
+          <w:tblHeader w:val="off"/>
+        </w:trPr>
+        <w:tc>
+          <w:tcPr>
+            <w:tcW w:type="dxa" w:w="900"/>
+            <w:tcMar>
+              <w:top w:type="dxa" w:w="60"/>
+              <w:left w:type="dxa" w:w="100"/>
+              <w:bottom w:type="dxa" w:w="60"/>
+              <w:right w:type="dxa" w:w="100"/>
+            </w:tcMar>
+            <w:vAlign w:val="top"/>
+          </w:tcPr>
+          <w:p>
+            <w:pPr>
+              <w:spacing w:after="60" w:before="40" w:line="300" w:lineRule="auto"/>
+            </w:pPr>
+            <w:r>
+              <w:rPr>
+                <w:rFonts w:ascii="Times New Roman" w:cs="Times New Roman" w:eastAsia="Times New Roman" w:hAnsi="Times New Roman"/>
+                <w:sz w:val="24"/>
+                <w:szCs w:val="24"/>
+              </w:rPr>
+              <w:t xml:space="preserve">ACT1</w:t>
+            </w:r>
+          </w:p>
+        </w:tc>
+        <w:tc>
+          <w:tcPr>
+            <w:tcW w:type="dxa" w:w="6055"/>
+            <w:tcMar>
+              <w:top w:type="dxa" w:w="60"/>
+              <w:left w:type="dxa" w:w="100"/>
+              <w:bottom w:type="dxa" w:w="60"/>
+              <w:right w:type="dxa" w:w="100"/>
+            </w:tcMar>
+            <w:vAlign w:val="top"/>
+          </w:tcPr>
+          <w:p>
+            <w:pPr>
+              <w:spacing w:after="60" w:before="40" w:line="300" w:lineRule="auto"/>
+            </w:pPr>
+            <w:r>
+              <w:rPr>
+                <w:rFonts w:ascii="Times New Roman" w:cs="Times New Roman" w:eastAsia="Times New Roman" w:hAnsi="Times New Roman"/>
+                <w:sz w:val="24"/>
+                <w:szCs w:val="24"/>
+              </w:rPr>
+              <w:t xml:space="preserve">HS trực tiếp làm, nói, tạo sản phẩm ≥ 70% thời lượng tiết học.</w:t>
+            </w:r>
+          </w:p>
+        </w:tc>
+        <w:tc>
+          <w:tcPr>
+            <w:tcW w:type="dxa" w:w="2400"/>
+            <w:tcMar>
+              <w:top w:type="dxa" w:w="60"/>
+              <w:left w:type="dxa" w:w="100"/>
+              <w:bottom w:type="dxa" w:w="60"/>
+              <w:right w:type="dxa" w:w="100"/>
+            </w:tcMar>
+            <w:vAlign w:val="top"/>
+          </w:tcPr>
+          <w:p>
+            <w:pPr>
+              <w:spacing w:after="60" w:before="40" w:line="300" w:lineRule="auto"/>
+            </w:pPr>
+            <w:r>
+              <w:rPr>
+                <w:rFonts w:ascii="Times New Roman" w:cs="Times New Roman" w:eastAsia="Times New Roman" w:hAnsi="Times New Roman"/>
+                <w:sz w:val="24"/>
+                <w:szCs w:val="24"/>
+              </w:rPr>
+              <w:t xml:space="preserve">HD2, HD3, HD4, HD5, HD6</w:t>
+            </w:r>
+          </w:p>
+        </w:tc>
+      </w:tr>
+      <w:tr>
+        <w:trPr>
+          <w:tblHeader w:val="off"/>
+        </w:trPr>
+        <w:tc>
+          <w:tcPr>
+            <w:tcW w:type="dxa" w:w="900"/>
+            <w:tcMar>
+              <w:top w:type="dxa" w:w="60"/>
+              <w:left w:type="dxa" w:w="100"/>
+              <w:bottom w:type="dxa" w:w="60"/>
+              <w:right w:type="dxa" w:w="100"/>
+            </w:tcMar>
+            <w:vAlign w:val="top"/>
+          </w:tcPr>
+          <w:p>
+            <w:pPr>
+              <w:spacing w:after="60" w:before="40" w:line="300" w:lineRule="auto"/>
+            </w:pPr>
+            <w:r>
+              <w:rPr>
+                <w:rFonts w:ascii="Times New Roman" w:cs="Times New Roman" w:eastAsia="Times New Roman" w:hAnsi="Times New Roman"/>
+                <w:sz w:val="24"/>
+                <w:szCs w:val="24"/>
+              </w:rPr>
+              <w:t xml:space="preserve">ACT2</w:t>
+            </w:r>
+          </w:p>
+        </w:tc>
+        <w:tc>
+          <w:tcPr>
+            <w:tcW w:type="dxa" w:w="6055"/>
+            <w:tcMar>
+              <w:top w:type="dxa" w:w="60"/>
+              <w:left w:type="dxa" w:w="100"/>
+              <w:bottom w:type="dxa" w:w="60"/>
+              <w:right w:type="dxa" w:w="100"/>
+            </w:tcMar>
+            <w:vAlign w:val="top"/>
+          </w:tcPr>
+          <w:p>
+            <w:pPr>
+              <w:spacing w:after="60" w:before="40" w:line="300" w:lineRule="auto"/>
+            </w:pPr>
+            <w:r>
+              <w:rPr>
+                <w:rFonts w:ascii="Times New Roman" w:cs="Times New Roman" w:eastAsia="Times New Roman" w:hAnsi="Times New Roman"/>
+                <w:sz w:val="24"/>
+                <w:szCs w:val="24"/>
+              </w:rPr>
+              <w:t xml:space="preserve">HS tương tác nhóm có phân vai: khảo sát, xếp hạng, chấm chéo (mức Tương tác).</w:t>
+            </w:r>
+          </w:p>
+        </w:tc>
+        <w:tc>
+          <w:tcPr>
+            <w:tcW w:type="dxa" w:w="2400"/>
+            <w:tcMar>
+              <w:top w:type="dxa" w:w="60"/>
+              <w:left w:type="dxa" w:w="100"/>
+              <w:bottom w:type="dxa" w:w="60"/>
+              <w:right w:type="dxa" w:w="100"/>
+            </w:tcMar>
+            <w:vAlign w:val="top"/>
+          </w:tcPr>
+          <w:p>
+            <w:pPr>
+              <w:spacing w:after="60" w:before="40" w:line="300" w:lineRule="auto"/>
+            </w:pPr>
+            <w:r>
+              <w:rPr>
+                <w:rFonts w:ascii="Times New Roman" w:cs="Times New Roman" w:eastAsia="Times New Roman" w:hAnsi="Times New Roman"/>
+                <w:sz w:val="24"/>
+                <w:szCs w:val="24"/>
+              </w:rPr>
+              <w:t xml:space="preserve">HD5, HD6</w:t>
             </w:r>
           </w:p>
         </w:tc>

</xml_diff>

<commit_message>
YCCĐ chỉ theo Chương trình GDPT 2018, bỏ đối chiếu SGK và PPCT của trường
- Prompt + schema: yêu cầu cần đạt viết theo CT GDPT 2018 (TT 32/2018); không đối chiếu SGK/PPCT; để rỗng tóm tắt SGK và ghi chú cần kiểm tra
- Tra cứu web (bản máy chủ) chỉ tìm YCCĐ trong CT 2018
- File Word + bản xem trước: phụ lục 'Yêu cầu cần đạt (Chương trình GDPT 2018)', bỏ khối đỏ 'kiểm tra lại theo SGK'
- Trang web: bỏ thông báo chi tiết SGK cần kiểm tra, cập nhật chân trang

Co-Authored-By: Claude Opus 5.5 <noreply@anthropic.com>
Claude-Session: https://claude.ai/code/session_013rNEKs6tcmtsXtauscuotv
</commit_message>
<xml_diff>
--- a/samples/output/TA7_Unit2_Lesson1_BaoCao.docx
+++ b/samples/output/TA7_Unit2_Lesson1_BaoCao.docx
@@ -2713,45 +2713,6 @@
           <w:szCs w:val="26"/>
         </w:rPr>
         <w:t xml:space="preserve">Giữ nguyên ngữ liệu, đáp án, 2 tranh gốc.</w:t>
-      </w:r>
-    </w:p>
-    <w:p>
-      <w:pPr>
-        <w:keepNext/>
-        <w:spacing w:after="80" w:before="120" w:line="300" w:lineRule="auto"/>
-      </w:pPr>
-      <w:r>
-        <w:rPr>
-          <w:rFonts w:ascii="Times New Roman" w:cs="Times New Roman" w:eastAsia="Times New Roman" w:hAnsi="Times New Roman"/>
-          <w:b/>
-          <w:bCs/>
-          <w:sz w:val="26"/>
-          <w:szCs w:val="26"/>
-        </w:rPr>
-        <w:t xml:space="preserve">Điểm GV cần kiểm tra lại theo SGK</w:t>
-      </w:r>
-    </w:p>
-    <w:p>
-      <w:pPr>
-        <w:spacing w:after="60" w:before="40" w:line="300" w:lineRule="auto"/>
-        <w:ind w:left="284"/>
-      </w:pPr>
-      <w:r>
-        <w:rPr>
-          <w:rFonts w:ascii="Times New Roman" w:cs="Times New Roman" w:eastAsia="Times New Roman" w:hAnsi="Times New Roman"/>
-          <w:sz w:val="26"/>
-          <w:szCs w:val="26"/>
-        </w:rPr>
-        <w:t xml:space="preserve">– </w:t>
-      </w:r>
-      <w:r>
-        <w:rPr>
-          <w:rFonts w:ascii="Times New Roman" w:cs="Times New Roman" w:eastAsia="Times New Roman" w:hAnsi="Times New Roman"/>
-          <w:color w:val="C00000"/>
-          <w:sz w:val="26"/>
-          <w:szCs w:val="26"/>
-        </w:rPr>
-        <w:t xml:space="preserve">YCCĐ chưa đối chiếu Phụ lục 1/PPCT của trường.</w:t>
       </w:r>
     </w:p>
     <w:p>

</xml_diff>